<commit_message>
docs(paper-b): record the intihal.net similarity report (1%, every source <1%)
Co-Authored-By: Claude Opus 5.5 <noreply@anthropic.com>
</commit_message>
<xml_diff>
--- a/docs/reports/paper_b/ci_journal/submission/paper_b_ci_cover_letter.docx
+++ b/docs/reports/paper_b/ci_journal/submission/paper_b_ci_cover_letter.docx
@@ -83,43 +83,91 @@
           <w:szCs w:val="22"/>
           <w:lang w:val="en-US"/>
         </w:rPr>
-        <w:t>Cancún, Quintana Roo, Mexico</w:t>
-      </w:r>
-    </w:p>
-    <w:p>
-      <w:pPr>
-        <w:spacing w:after="0"/>
-        <w:rPr>
-          <w:rFonts w:ascii="Times New Roman" w:hAnsi="Times New Roman" w:cs="Times New Roman"/>
-          <w:sz w:val="22"/>
-          <w:szCs w:val="22"/>
-          <w:lang w:val="en-US"/>
-        </w:rPr>
-      </w:pPr>
-      <w:r>
-        <w:rPr>
-          <w:rFonts w:ascii="Times New Roman" w:hAnsi="Times New Roman" w:cs="Times New Roman"/>
-          <w:sz w:val="22"/>
-          <w:szCs w:val="22"/>
-          <w:lang w:val="en-US"/>
-        </w:rPr>
-        <w:t>[date of submission]</w:t>
-      </w:r>
-    </w:p>
-    <w:p>
-      <w:pPr>
-        <w:spacing w:after="0"/>
-        <w:rPr>
-          <w:rFonts w:ascii="Times New Roman" w:hAnsi="Times New Roman" w:cs="Times New Roman"/>
-          <w:sz w:val="22"/>
-          <w:szCs w:val="22"/>
-          <w:lang w:val="en-US"/>
-        </w:rPr>
-      </w:pPr>
-    </w:p>
-    <w:p>
-      <w:pPr>
-        <w:spacing w:after="0"/>
+        <w:t xml:space="preserve">Cancún, </w:t>
+      </w:r>
+      <w:proofErr w:type="spellStart"/>
+      <w:r>
+        <w:rPr>
+          <w:rFonts w:ascii="Times New Roman" w:hAnsi="Times New Roman" w:cs="Times New Roman"/>
+          <w:sz w:val="22"/>
+          <w:szCs w:val="22"/>
+          <w:lang w:val="en-US"/>
+        </w:rPr>
+        <w:t>Quintana</w:t>
+      </w:r>
+      <w:proofErr w:type="spellEnd"/>
+      <w:r>
+        <w:rPr>
+          <w:rFonts w:ascii="Times New Roman" w:hAnsi="Times New Roman" w:cs="Times New Roman"/>
+          <w:sz w:val="22"/>
+          <w:szCs w:val="22"/>
+          <w:lang w:val="en-US"/>
+        </w:rPr>
+        <w:t xml:space="preserve"> Roo, Mexico</w:t>
+      </w:r>
+    </w:p>
+    <w:p>
+      <w:pPr>
+        <w:spacing w:after="0"/>
+        <w:rPr>
+          <w:rFonts w:ascii="Times New Roman" w:hAnsi="Times New Roman" w:cs="Times New Roman"/>
+          <w:b/>
+          <w:bCs/>
+          <w:sz w:val="22"/>
+          <w:szCs w:val="22"/>
+          <w:lang w:val="en-US"/>
+        </w:rPr>
+      </w:pPr>
+      <w:r>
+        <w:rPr>
+          <w:rFonts w:ascii="Times New Roman" w:hAnsi="Times New Roman" w:cs="Times New Roman"/>
+          <w:b/>
+          <w:bCs/>
+          <w:sz w:val="22"/>
+          <w:szCs w:val="22"/>
+          <w:lang w:val="en-US"/>
+        </w:rPr>
+        <w:t>Oct, 21</w:t>
+      </w:r>
+      <w:r>
+        <w:rPr>
+          <w:rFonts w:ascii="Times New Roman" w:hAnsi="Times New Roman" w:cs="Times New Roman"/>
+          <w:b/>
+          <w:bCs/>
+          <w:sz w:val="22"/>
+          <w:szCs w:val="22"/>
+          <w:vertAlign w:val="superscript"/>
+          <w:lang w:val="en-US"/>
+        </w:rPr>
+        <w:t>st</w:t>
+      </w:r>
+      <w:r>
+        <w:rPr>
+          <w:rFonts w:ascii="Times New Roman" w:hAnsi="Times New Roman" w:cs="Times New Roman"/>
+          <w:b/>
+          <w:bCs/>
+          <w:sz w:val="22"/>
+          <w:szCs w:val="22"/>
+          <w:lang w:val="en-US"/>
+        </w:rPr>
+        <w:t>, 2026</w:t>
+      </w:r>
+    </w:p>
+    <w:p>
+      <w:pPr>
+        <w:spacing w:after="0"/>
+        <w:rPr>
+          <w:rFonts w:ascii="Times New Roman" w:hAnsi="Times New Roman" w:cs="Times New Roman"/>
+          <w:sz w:val="22"/>
+          <w:szCs w:val="22"/>
+          <w:lang w:val="en-US"/>
+        </w:rPr>
+      </w:pPr>
+    </w:p>
+    <w:p>
+      <w:pPr>
+        <w:spacing w:after="0"/>
+        <w:jc w:val="both"/>
         <w:rPr>
           <w:rFonts w:ascii="Times New Roman" w:hAnsi="Times New Roman" w:cs="Times New Roman"/>
           <w:sz w:val="22"/>
@@ -140,6 +188,7 @@
     <w:p>
       <w:pPr>
         <w:pStyle w:val="Default"/>
+        <w:jc w:val="both"/>
         <w:rPr>
           <w:rFonts w:ascii="Times New Roman" w:hAnsi="Times New Roman" w:cs="Times New Roman"/>
           <w:color w:val="auto"/>
@@ -162,6 +211,7 @@
     <w:p>
       <w:pPr>
         <w:spacing w:after="0"/>
+        <w:jc w:val="both"/>
         <w:rPr>
           <w:rFonts w:ascii="Times New Roman" w:hAnsi="Times New Roman" w:cs="Times New Roman"/>
           <w:sz w:val="22"/>
@@ -182,6 +232,7 @@
     <w:p>
       <w:pPr>
         <w:pStyle w:val="Default"/>
+        <w:jc w:val="both"/>
         <w:rPr>
           <w:rFonts w:ascii="Times New Roman" w:hAnsi="Times New Roman" w:cs="Times New Roman"/>
           <w:color w:val="auto"/>
@@ -204,6 +255,7 @@
     <w:p>
       <w:pPr>
         <w:spacing w:after="0"/>
+        <w:jc w:val="both"/>
         <w:rPr>
           <w:rFonts w:ascii="Times New Roman" w:hAnsi="Times New Roman" w:cs="Times New Roman"/>
           <w:sz w:val="22"/>
@@ -224,26 +276,108 @@
     <w:p>
       <w:pPr>
         <w:spacing w:after="0"/>
-        <w:rPr>
-          <w:rFonts w:ascii="Times New Roman" w:hAnsi="Times New Roman" w:cs="Times New Roman"/>
-          <w:sz w:val="22"/>
-          <w:szCs w:val="22"/>
-          <w:lang w:val="en-US"/>
-        </w:rPr>
-      </w:pPr>
-      <w:r>
-        <w:rPr>
-          <w:rFonts w:ascii="Times New Roman" w:hAnsi="Times New Roman" w:cs="Times New Roman"/>
-          <w:sz w:val="22"/>
-          <w:szCs w:val="22"/>
-          <w:lang w:val="en-US"/>
-        </w:rPr>
-        <w:t>Relation to earlier work. The runs analysed here were released with an earlier article by the author and a co-author (Revista de Investigación Multidisciplinaria Iberoamericana, https://doi.org/10.69850/rimi.vi3.307), which includes a paired SHAP–LIME test on a 45-cell subset of three model families. The present manuscript extends that test to the full 75 cells, adds confidence intervals and effect sizes, and contributes the conditional results above, which are not in that article; it restates none of its numerical results. Other manuscripts by the author, under review at other journals, analyse the same runs for different questions and report none of the results reported here. The code, the run artifacts and earlier drafts of this work are in a public repository, archived at https://doi.org/10.5281/zenodo.23147228; this may show in the similarity report.</w:t>
+        <w:jc w:val="both"/>
+        <w:rPr>
+          <w:rFonts w:ascii="Times New Roman" w:hAnsi="Times New Roman" w:cs="Times New Roman"/>
+          <w:sz w:val="22"/>
+          <w:szCs w:val="22"/>
+          <w:lang w:val="en-US"/>
+        </w:rPr>
+      </w:pPr>
+      <w:r>
+        <w:rPr>
+          <w:rFonts w:ascii="Times New Roman" w:hAnsi="Times New Roman" w:cs="Times New Roman"/>
+          <w:sz w:val="22"/>
+          <w:szCs w:val="22"/>
+          <w:lang w:val="en-US"/>
+        </w:rPr>
+        <w:t xml:space="preserve">Relation to earlier work. The runs </w:t>
+      </w:r>
+      <w:proofErr w:type="spellStart"/>
+      <w:r>
+        <w:rPr>
+          <w:rFonts w:ascii="Times New Roman" w:hAnsi="Times New Roman" w:cs="Times New Roman"/>
+          <w:sz w:val="22"/>
+          <w:szCs w:val="22"/>
+          <w:lang w:val="en-US"/>
+        </w:rPr>
+        <w:t>analysed</w:t>
+      </w:r>
+      <w:proofErr w:type="spellEnd"/>
+      <w:r>
+        <w:rPr>
+          <w:rFonts w:ascii="Times New Roman" w:hAnsi="Times New Roman" w:cs="Times New Roman"/>
+          <w:sz w:val="22"/>
+          <w:szCs w:val="22"/>
+          <w:lang w:val="en-US"/>
+        </w:rPr>
+        <w:t xml:space="preserve"> here were released with an earlier article by the author and a co-author (Revista de </w:t>
+      </w:r>
+      <w:proofErr w:type="spellStart"/>
+      <w:r>
+        <w:rPr>
+          <w:rFonts w:ascii="Times New Roman" w:hAnsi="Times New Roman" w:cs="Times New Roman"/>
+          <w:sz w:val="22"/>
+          <w:szCs w:val="22"/>
+          <w:lang w:val="en-US"/>
+        </w:rPr>
+        <w:t>Investigación</w:t>
+      </w:r>
+      <w:proofErr w:type="spellEnd"/>
+      <w:r>
+        <w:rPr>
+          <w:rFonts w:ascii="Times New Roman" w:hAnsi="Times New Roman" w:cs="Times New Roman"/>
+          <w:sz w:val="22"/>
+          <w:szCs w:val="22"/>
+          <w:lang w:val="en-US"/>
+        </w:rPr>
+        <w:t xml:space="preserve"> </w:t>
+      </w:r>
+      <w:proofErr w:type="spellStart"/>
+      <w:r>
+        <w:rPr>
+          <w:rFonts w:ascii="Times New Roman" w:hAnsi="Times New Roman" w:cs="Times New Roman"/>
+          <w:sz w:val="22"/>
+          <w:szCs w:val="22"/>
+          <w:lang w:val="en-US"/>
+        </w:rPr>
+        <w:t>Multidisciplinaria</w:t>
+      </w:r>
+      <w:proofErr w:type="spellEnd"/>
+      <w:r>
+        <w:rPr>
+          <w:rFonts w:ascii="Times New Roman" w:hAnsi="Times New Roman" w:cs="Times New Roman"/>
+          <w:sz w:val="22"/>
+          <w:szCs w:val="22"/>
+          <w:lang w:val="en-US"/>
+        </w:rPr>
+        <w:t xml:space="preserve"> Iberoamericana, https://doi.org/10.69850/rimi.vi3.307), which includes a paired SHAP–LIME test on a 45-cell subset of three model families. The present manuscript extends that test to the full 75 cells, adds confidence intervals and effect sizes, and contributes the conditional results above, which are not in that article; it restates none of its numerical results. Other manuscripts by the author, under review at other journals, </w:t>
+      </w:r>
+      <w:proofErr w:type="spellStart"/>
+      <w:r>
+        <w:rPr>
+          <w:rFonts w:ascii="Times New Roman" w:hAnsi="Times New Roman" w:cs="Times New Roman"/>
+          <w:sz w:val="22"/>
+          <w:szCs w:val="22"/>
+          <w:lang w:val="en-US"/>
+        </w:rPr>
+        <w:t>analyse</w:t>
+      </w:r>
+      <w:proofErr w:type="spellEnd"/>
+      <w:r>
+        <w:rPr>
+          <w:rFonts w:ascii="Times New Roman" w:hAnsi="Times New Roman" w:cs="Times New Roman"/>
+          <w:sz w:val="22"/>
+          <w:szCs w:val="22"/>
+          <w:lang w:val="en-US"/>
+        </w:rPr>
+        <w:t xml:space="preserve"> the same runs for different questions and report none of the results reported here. The code, the run artifacts and earlier drafts of this work are in a public repository, archived at https://doi.org/10.5281/zenodo.23147228; this may show in the similarity report.</w:t>
       </w:r>
     </w:p>
     <w:p>
       <w:pPr>
         <w:pStyle w:val="Default"/>
+        <w:jc w:val="both"/>
         <w:rPr>
           <w:rFonts w:ascii="Times New Roman" w:hAnsi="Times New Roman" w:cs="Times New Roman"/>
           <w:color w:val="auto"/>
@@ -256,6 +390,7 @@
     <w:p>
       <w:pPr>
         <w:pStyle w:val="Default"/>
+        <w:jc w:val="both"/>
         <w:rPr>
           <w:rFonts w:ascii="Times New Roman" w:hAnsi="Times New Roman" w:cs="Times New Roman"/>
           <w:color w:val="auto"/>
@@ -278,6 +413,7 @@
     <w:p>
       <w:pPr>
         <w:spacing w:after="0"/>
+        <w:jc w:val="both"/>
         <w:rPr>
           <w:rFonts w:ascii="Times New Roman" w:hAnsi="Times New Roman" w:cs="Times New Roman"/>
           <w:sz w:val="22"/>
@@ -298,6 +434,7 @@
     <w:p>
       <w:pPr>
         <w:spacing w:after="0"/>
+        <w:jc w:val="both"/>
         <w:rPr>
           <w:rFonts w:ascii="Times New Roman" w:hAnsi="Times New Roman" w:cs="Times New Roman"/>
           <w:sz w:val="22"/>
@@ -314,6 +451,90 @@
         </w:rPr>
         <w:t xml:space="preserve">Thank you for your consideration of this manuscript. </w:t>
       </w:r>
+    </w:p>
+    <w:p>
+      <w:pPr>
+        <w:spacing w:after="0"/>
+        <w:jc w:val="both"/>
+        <w:rPr>
+          <w:rFonts w:ascii="Times New Roman" w:hAnsi="Times New Roman" w:cs="Times New Roman"/>
+          <w:sz w:val="22"/>
+          <w:szCs w:val="22"/>
+          <w:lang w:val="en-US"/>
+        </w:rPr>
+      </w:pPr>
+    </w:p>
+    <w:p>
+      <w:pPr>
+        <w:spacing w:after="0"/>
+        <w:jc w:val="both"/>
+        <w:rPr>
+          <w:rFonts w:ascii="Times New Roman" w:hAnsi="Times New Roman" w:cs="Times New Roman"/>
+          <w:sz w:val="22"/>
+          <w:szCs w:val="22"/>
+          <w:lang w:val="en-US"/>
+        </w:rPr>
+      </w:pPr>
+    </w:p>
+    <w:p>
+      <w:pPr>
+        <w:spacing w:after="0"/>
+        <w:jc w:val="both"/>
+        <w:rPr>
+          <w:rFonts w:ascii="Times New Roman" w:hAnsi="Times New Roman" w:cs="Times New Roman"/>
+          <w:sz w:val="22"/>
+          <w:szCs w:val="22"/>
+          <w:lang w:val="en-US"/>
+        </w:rPr>
+      </w:pPr>
+    </w:p>
+    <w:p>
+      <w:pPr>
+        <w:spacing w:after="0"/>
+        <w:jc w:val="both"/>
+        <w:rPr>
+          <w:rFonts w:ascii="Times New Roman" w:hAnsi="Times New Roman" w:cs="Times New Roman"/>
+          <w:sz w:val="22"/>
+          <w:szCs w:val="22"/>
+          <w:lang w:val="en-US"/>
+        </w:rPr>
+      </w:pPr>
+    </w:p>
+    <w:p>
+      <w:pPr>
+        <w:spacing w:after="0"/>
+        <w:jc w:val="both"/>
+        <w:rPr>
+          <w:rFonts w:ascii="Times New Roman" w:hAnsi="Times New Roman" w:cs="Times New Roman"/>
+          <w:sz w:val="22"/>
+          <w:szCs w:val="22"/>
+          <w:lang w:val="en-US"/>
+        </w:rPr>
+      </w:pPr>
+    </w:p>
+    <w:p>
+      <w:pPr>
+        <w:spacing w:after="0"/>
+        <w:jc w:val="both"/>
+        <w:rPr>
+          <w:rFonts w:ascii="Times New Roman" w:hAnsi="Times New Roman" w:cs="Times New Roman"/>
+          <w:sz w:val="22"/>
+          <w:szCs w:val="22"/>
+          <w:lang w:val="en-US"/>
+        </w:rPr>
+      </w:pPr>
+    </w:p>
+    <w:p>
+      <w:pPr>
+        <w:spacing w:after="0"/>
+        <w:jc w:val="both"/>
+        <w:rPr>
+          <w:rFonts w:ascii="Times New Roman" w:hAnsi="Times New Roman" w:cs="Times New Roman"/>
+          <w:sz w:val="22"/>
+          <w:szCs w:val="22"/>
+          <w:lang w:val="en-US"/>
+        </w:rPr>
+      </w:pPr>
     </w:p>
     <w:p>
       <w:pPr>

</xml_diff>